<commit_message>
Promote showcase README to repo root; rebrand to 'ideation' (remove hazel mentions)
- Root README.md now holds the full product/skills showcase (image paths fixed)
- code/README.md trimmed to an engineering pointer
- Replaced all 'hazel' mentions with 'ideation' across text + .docx
- Renamed design/ideation-ux-reference.md
</commit_message>
<xml_diff>
--- a/docs/Verra_BRD.docx
+++ b/docs/Verra_BRD.docx
@@ -58,7 +58,7 @@
           <w:sz w:val="26"/>
           <w:szCs w:val="26"/>
         </w:rPr>
-        <w:t xml:space="preserve">A multi-tenant, multi-jurisdiction AI engine — UX modeled on hazel.ai</w:t>
+        <w:t xml:space="preserve">A multi-tenant, multi-jurisdiction AI engine — UX modeled on ideation</w:t>
       </w:r>
     </w:p>
     <w:tbl>
@@ -605,7 +605,7 @@
         <w:spacing w:after="120" w:line="276"/>
       </w:pPr>
       <w:r>
-        <w:t xml:space="preserve">The product is delivered as a single multi-tenant platform with three tailored experiences: professional firms (accounting, CPA, audit), in-house company finance teams, and individuals/small businesses. The user experience is modeled on hazel.ai's calm, conversational, security-first interface, extended from wealth-advisory tax planning into the full accounting, audit and compliance lifecycle.</w:t>
+        <w:t xml:space="preserve">The product is delivered as a single multi-tenant platform with three tailored experiences: professional firms (accounting, CPA, audit), in-house company finance teams, and individuals/small businesses. The user experience is modeled on ideation's calm, conversational, security-first interface, extended from wealth-advisory tax planning into the full accounting, audit and compliance lifecycle.</w:t>
       </w:r>
     </w:p>
     <w:p>
@@ -1545,7 +1545,7 @@
         <w:spacing w:after="120" w:line="276"/>
       </w:pPr>
       <w:r>
-        <w:t xml:space="preserve">The market is fragmenting into point solutions by workflow. Verra's differentiation is breadth (one engine across all four domains), multi-tenancy (firms + companies + individuals), and multi-jurisdiction coverage — combined with hazel.ai-grade UX and governance.</w:t>
+        <w:t xml:space="preserve">The market is fragmenting into point solutions by workflow. Verra's differentiation is breadth (one engine across all four domains), multi-tenancy (firms + companies + individuals), and multi-jurisdiction coverage — combined with ideation-grade UX and governance.</w:t>
       </w:r>
     </w:p>
     <w:tbl>
@@ -1697,7 +1697,7 @@
                 <w:sz w:val="18"/>
                 <w:szCs w:val="18"/>
               </w:rPr>
-              <w:t xml:space="preserve">Hazel (Altruist)</w:t>
+              <w:t xml:space="preserve">Ideation (Altruist)</w:t>
             </w:r>
           </w:p>
         </w:tc>

</xml_diff>